<commit_message>
fix: empêcher l'écrasement des images extraites
Vérification de l'existence des images avant leur sauvegarde.

Ajout d'un compteur pour générer un nom unique lorsqu'une image différente porte déjà le même nom.

Réutilisation des fichiers lorsque les images sont identiques.
</commit_message>
<xml_diff>
--- a/Integration_all/Test.docx
+++ b/Integration_all/Test.docx
@@ -10,7 +10,6 @@
         <w:t>Mon document</w:t>
       </w:r>
     </w:p>
-    <w:p/>
     <w:p>
       <w:pPr>
         <w:pStyle w:val="Titre2"/>
@@ -19,13 +18,11 @@
         <w:t>Introduction</w:t>
       </w:r>
     </w:p>
-    <w:p/>
     <w:p>
       <w:r>
         <w:t>Ceci est un texte normal.</w:t>
       </w:r>
     </w:p>
-    <w:p/>
     <w:p>
       <w:pPr>
         <w:rPr>
@@ -72,17 +69,7 @@
           <w:i/>
           <w:iCs/>
         </w:rPr>
-        <w:t xml:space="preserve">Ceci est en </w:t>
-      </w:r>
-      <w:proofErr w:type="spellStart"/>
-      <w:r>
-        <w:rPr>
-          <w:b/>
-          <w:bCs/>
-          <w:i/>
-          <w:iCs/>
-        </w:rPr>
-        <w:t>italique</w:t>
+        <w:t>Ceci est en italique</w:t>
       </w:r>
       <w:r>
         <w:rPr>
@@ -102,7 +89,6 @@
         </w:rPr>
         <w:t>Gras</w:t>
       </w:r>
-      <w:proofErr w:type="spellEnd"/>
       <w:r>
         <w:rPr>
           <w:b/>
@@ -113,12 +99,37 @@
         <w:t>.</w:t>
       </w:r>
     </w:p>
-    <w:p/>
     <w:p>
       <w:pPr>
         <w:pStyle w:val="Titre3"/>
       </w:pPr>
       <w:r>
+        <w:t xml:space="preserve">Mon lien : </w:t>
+      </w:r>
+    </w:p>
+    <w:p>
+      <w:pPr>
+        <w:rPr>
+          <w:b/>
+          <w:bCs/>
+          <w:i/>
+          <w:iCs/>
+        </w:rPr>
+      </w:pPr>
+      <w:hyperlink r:id="rId4" w:history="1">
+        <w:r>
+          <w:rPr>
+            <w:rStyle w:val="Lienhypertexte"/>
+          </w:rPr>
+          <w:t>https://cegepsherbrooke.qc.ca/</w:t>
+        </w:r>
+      </w:hyperlink>
+    </w:p>
+    <w:p>
+      <w:pPr>
+        <w:pStyle w:val="Titre3"/>
+      </w:pPr>
+      <w:r>
         <w:t>Ma liste :</w:t>
       </w:r>
     </w:p>
@@ -137,7 +148,6 @@
         <w:t>• Orange</w:t>
       </w:r>
     </w:p>
-    <w:p/>
     <w:p>
       <w:pPr>
         <w:pStyle w:val="Titre3"/>
@@ -176,18 +186,6 @@
           <w:rStyle w:val="Titre3Car"/>
         </w:rPr>
         <w:t>Mon tableau :</w:t>
-      </w:r>
-      <w:r>
-        <w:rPr>
-          <w:rStyle w:val="Titre3Car"/>
-        </w:rPr>
-        <w:br/>
-      </w:r>
-      <w:r>
-        <w:rPr>
-          <w:rStyle w:val="Titre3Car"/>
-        </w:rPr>
-        <w:br/>
       </w:r>
     </w:p>
     <w:tbl>
@@ -241,11 +239,9 @@
             <w:tcW w:w="1393" w:type="dxa"/>
           </w:tcPr>
           <w:p>
-            <w:proofErr w:type="spellStart"/>
             <w:r>
               <w:t>Barcola</w:t>
             </w:r>
-            <w:proofErr w:type="spellEnd"/>
           </w:p>
         </w:tc>
       </w:tr>
@@ -258,11 +254,9 @@
             <w:tcW w:w="1392" w:type="dxa"/>
           </w:tcPr>
           <w:p>
-            <w:proofErr w:type="spellStart"/>
             <w:r>
               <w:t>Vitinha</w:t>
             </w:r>
-            <w:proofErr w:type="spellEnd"/>
           </w:p>
         </w:tc>
         <w:tc>
@@ -270,23 +264,9 @@
             <w:tcW w:w="1392" w:type="dxa"/>
           </w:tcPr>
           <w:p>
-            <w:proofErr w:type="spellStart"/>
             <w:r>
               <w:t>Veratti</w:t>
             </w:r>
-            <w:proofErr w:type="spellEnd"/>
-          </w:p>
-        </w:tc>
-        <w:tc>
-          <w:tcPr>
-            <w:tcW w:w="1393" w:type="dxa"/>
-          </w:tcPr>
-          <w:p>
-            <w:proofErr w:type="spellStart"/>
-            <w:r>
-              <w:t>Mazadona</w:t>
-            </w:r>
-            <w:proofErr w:type="spellEnd"/>
           </w:p>
         </w:tc>
         <w:tc>
@@ -295,13 +275,18 @@
           </w:tcPr>
           <w:p>
             <w:r>
-              <w:t>Zaire-</w:t>
+              <w:t>Mazadona</w:t>
             </w:r>
-            <w:proofErr w:type="spellStart"/>
+          </w:p>
+        </w:tc>
+        <w:tc>
+          <w:tcPr>
+            <w:tcW w:w="1393" w:type="dxa"/>
+          </w:tcPr>
+          <w:p>
             <w:r>
-              <w:t>emery</w:t>
+              <w:t>Zaire-emery</w:t>
             </w:r>
-            <w:proofErr w:type="spellEnd"/>
           </w:p>
         </w:tc>
       </w:tr>
@@ -324,13 +309,9 @@
             <w:tcW w:w="1392" w:type="dxa"/>
           </w:tcPr>
           <w:p>
-            <w:proofErr w:type="spellStart"/>
-            <w:proofErr w:type="gramStart"/>
             <w:r>
               <w:t>mendes</w:t>
             </w:r>
-            <w:proofErr w:type="spellEnd"/>
-            <w:proofErr w:type="gramEnd"/>
           </w:p>
         </w:tc>
         <w:tc>
@@ -338,13 +319,9 @@
             <w:tcW w:w="1393" w:type="dxa"/>
           </w:tcPr>
           <w:p>
-            <w:proofErr w:type="spellStart"/>
-            <w:proofErr w:type="gramStart"/>
             <w:r>
               <w:t>marquinhos</w:t>
             </w:r>
-            <w:proofErr w:type="spellEnd"/>
-            <w:proofErr w:type="gramEnd"/>
           </w:p>
         </w:tc>
         <w:tc>
@@ -360,7 +337,6 @@
       </w:tr>
     </w:tbl>
     <w:p/>
-    <w:p/>
     <w:p>
       <w:pPr>
         <w:pStyle w:val="Titre3"/>
@@ -370,7 +346,7 @@
       </w:r>
     </w:p>
     <w:p>
-      <w:hyperlink r:id="rId4" w:history="1">
+      <w:hyperlink r:id="rId5" w:history="1">
         <w:r>
           <w:rPr>
             <w:rStyle w:val="Lienhypertexte"/>
@@ -408,10 +384,10 @@
           <w:noProof/>
         </w:rPr>
         <w:drawing>
-          <wp:inline distT="0" distB="0" distL="0" distR="0" wp14:anchorId="5B0F23B3" wp14:editId="081FA4FC">
-            <wp:extent cx="5760720" cy="3242310"/>
+          <wp:inline distT="0" distB="0" distL="0" distR="0" wp14:anchorId="083D90C6" wp14:editId="3E00C3DD">
+            <wp:extent cx="5760720" cy="3240405"/>
             <wp:effectExtent l="0" t="0" r="0" b="0"/>
-            <wp:docPr id="1701911902" name="Image 1"/>
+            <wp:docPr id="314153537" name="Image 1"/>
             <wp:cNvGraphicFramePr>
               <a:graphicFrameLocks xmlns:a="http://schemas.openxmlformats.org/drawingml/2006/main" noChangeAspect="1"/>
             </wp:cNvGraphicFramePr>
@@ -419,29 +395,36 @@
               <a:graphicData uri="http://schemas.openxmlformats.org/drawingml/2006/picture">
                 <pic:pic xmlns:pic="http://schemas.openxmlformats.org/drawingml/2006/picture">
                   <pic:nvPicPr>
-                    <pic:cNvPr id="1701911902" name="Image 1701911902"/>
-                    <pic:cNvPicPr/>
+                    <pic:cNvPr id="0" name="Picture 1"/>
+                    <pic:cNvPicPr>
+                      <a:picLocks noChangeAspect="1" noChangeArrowheads="1"/>
+                    </pic:cNvPicPr>
                   </pic:nvPicPr>
                   <pic:blipFill>
-                    <a:blip r:embed="rId5" cstate="print">
+                    <a:blip r:embed="rId6" cstate="print">
                       <a:extLst>
                         <a:ext uri="{28A0092B-C50C-407E-A947-70E740481C1C}">
                           <a14:useLocalDpi xmlns:a14="http://schemas.microsoft.com/office/drawing/2010/main" val="0"/>
                         </a:ext>
                       </a:extLst>
                     </a:blip>
+                    <a:srcRect/>
                     <a:stretch>
                       <a:fillRect/>
                     </a:stretch>
                   </pic:blipFill>
-                  <pic:spPr>
+                  <pic:spPr bwMode="auto">
                     <a:xfrm>
                       <a:off x="0" y="0"/>
-                      <a:ext cx="5760720" cy="3242310"/>
+                      <a:ext cx="5760720" cy="3240405"/>
                     </a:xfrm>
                     <a:prstGeom prst="rect">
                       <a:avLst/>
                     </a:prstGeom>
+                    <a:noFill/>
+                    <a:ln>
+                      <a:noFill/>
+                    </a:ln>
                   </pic:spPr>
                 </pic:pic>
               </a:graphicData>
@@ -860,6 +843,7 @@
   <w:style w:type="paragraph" w:default="1" w:styleId="Normal">
     <w:name w:val="Normal"/>
     <w:qFormat/>
+    <w:rsid w:val="00B55EEE"/>
   </w:style>
   <w:style w:type="paragraph" w:styleId="Titre1">
     <w:name w:val="heading 1"/>

</xml_diff>